<commit_message>
Update LNCS Pre-Filled Copyright Form.docx
</commit_message>
<xml_diff>
--- a/cfp/LNCS Pre-Filled Copyright Form.docx
+++ b/cfp/LNCS Pre-Filled Copyright Form.docx
@@ -1,6 +1,6 @@
 
 <file path=word/document.xml><?xml version="1.0" encoding="utf-8"?>
-<w:document xmlns:wpc="http://schemas.microsoft.com/office/word/2010/wordprocessingCanvas" xmlns:cx="http://schemas.microsoft.com/office/drawing/2014/chartex" xmlns:cx1="http://schemas.microsoft.com/office/drawing/2015/9/8/chartex" xmlns:cx2="http://schemas.microsoft.com/office/drawing/2015/10/21/chartex" xmlns:cx3="http://schemas.microsoft.com/office/drawing/2016/5/9/chartex" xmlns:cx4="http://schemas.microsoft.com/office/drawing/2016/5/10/chartex" xmlns:cx5="http://schemas.microsoft.com/office/drawing/2016/5/11/chartex" xmlns:cx6="http://schemas.microsoft.com/office/drawing/2016/5/12/chartex" xmlns:cx7="http://schemas.microsoft.com/office/drawing/2016/5/13/chartex" xmlns:cx8="http://schemas.microsoft.com/office/drawing/2016/5/14/chartex" xmlns:mc="http://schemas.openxmlformats.org/markup-compatibility/2006" xmlns:aink="http://schemas.microsoft.com/office/drawing/2016/ink" xmlns:am3d="http://schemas.microsoft.com/office/drawing/2017/model3d" xmlns:o="urn:schemas-microsoft-com:office:office" xmlns:oel="http://schemas.microsoft.com/office/2019/extlst" xmlns:r="http://schemas.openxmlformats.org/officeDocument/2006/relationships" xmlns:m="http://schemas.openxmlformats.org/officeDocument/2006/math" xmlns:v="urn:schemas-microsoft-com:vml" xmlns:wp14="http://schemas.microsoft.com/office/word/2010/wordprocessingDrawing" xmlns:wp="http://schemas.openxmlformats.org/drawingml/2006/wordprocessingDrawing" xmlns:w10="urn:schemas-microsoft-com:office:word" xmlns:w="http://schemas.openxmlformats.org/wordprocessingml/2006/main" xmlns:w14="http://schemas.microsoft.com/office/word/2010/wordml" xmlns:w15="http://schemas.microsoft.com/office/word/2012/wordml" xmlns:w16cex="http://schemas.microsoft.com/office/word/2018/wordml/cex" xmlns:w16cid="http://schemas.microsoft.com/office/word/2016/wordml/cid" xmlns:w16="http://schemas.microsoft.com/office/word/2018/wordml" xmlns:w16sdtdh="http://schemas.microsoft.com/office/word/2020/wordml/sdtdatahash" xmlns:w16se="http://schemas.microsoft.com/office/word/2015/wordml/symex" xmlns:wpg="http://schemas.microsoft.com/office/word/2010/wordprocessingGroup" xmlns:wpi="http://schemas.microsoft.com/office/word/2010/wordprocessingInk" xmlns:wne="http://schemas.microsoft.com/office/word/2006/wordml" xmlns:wps="http://schemas.microsoft.com/office/word/2010/wordprocessingShape" mc:Ignorable="w14 w15 w16se w16cid w16 w16cex w16sdtdh wp14">
+<w:document xmlns:wpc="http://schemas.microsoft.com/office/word/2010/wordprocessingCanvas" xmlns:cx="http://schemas.microsoft.com/office/drawing/2014/chartex" xmlns:cx1="http://schemas.microsoft.com/office/drawing/2015/9/8/chartex" xmlns:cx2="http://schemas.microsoft.com/office/drawing/2015/10/21/chartex" xmlns:cx3="http://schemas.microsoft.com/office/drawing/2016/5/9/chartex" xmlns:cx4="http://schemas.microsoft.com/office/drawing/2016/5/10/chartex" xmlns:cx5="http://schemas.microsoft.com/office/drawing/2016/5/11/chartex" xmlns:cx6="http://schemas.microsoft.com/office/drawing/2016/5/12/chartex" xmlns:cx7="http://schemas.microsoft.com/office/drawing/2016/5/13/chartex" xmlns:cx8="http://schemas.microsoft.com/office/drawing/2016/5/14/chartex" xmlns:mc="http://schemas.openxmlformats.org/markup-compatibility/2006" xmlns:aink="http://schemas.microsoft.com/office/drawing/2016/ink" xmlns:am3d="http://schemas.microsoft.com/office/drawing/2017/model3d" xmlns:o="urn:schemas-microsoft-com:office:office" xmlns:oel="http://schemas.microsoft.com/office/2019/extlst" xmlns:r="http://schemas.openxmlformats.org/officeDocument/2006/relationships" xmlns:m="http://schemas.openxmlformats.org/officeDocument/2006/math" xmlns:v="urn:schemas-microsoft-com:vml" xmlns:wp14="http://schemas.microsoft.com/office/word/2010/wordprocessingDrawing" xmlns:wp="http://schemas.openxmlformats.org/drawingml/2006/wordprocessingDrawing" xmlns:w10="urn:schemas-microsoft-com:office:word" xmlns:w="http://schemas.openxmlformats.org/wordprocessingml/2006/main" xmlns:w14="http://schemas.microsoft.com/office/word/2010/wordml" xmlns:w15="http://schemas.microsoft.com/office/word/2012/wordml" xmlns:w16cex="http://schemas.microsoft.com/office/word/2018/wordml/cex" xmlns:w16cid="http://schemas.microsoft.com/office/word/2016/wordml/cid" xmlns:w16="http://schemas.microsoft.com/office/word/2018/wordml" xmlns:w16du="http://schemas.microsoft.com/office/word/2023/wordml/word16du" xmlns:w16sdtdh="http://schemas.microsoft.com/office/word/2020/wordml/sdtdatahash" xmlns:w16sdtfl="http://schemas.microsoft.com/office/word/2024/wordml/sdtformatlock" xmlns:w16se="http://schemas.microsoft.com/office/word/2015/wordml/symex" xmlns:wpg="http://schemas.microsoft.com/office/word/2010/wordprocessingGroup" xmlns:wpi="http://schemas.microsoft.com/office/word/2010/wordprocessingInk" xmlns:wne="http://schemas.microsoft.com/office/word/2006/wordml" xmlns:wps="http://schemas.microsoft.com/office/word/2010/wordprocessingShape" mc:Ignorable="w14 w15 w16se w16cid w16 w16cex w16sdtdh w16sdtfl w16du wp14">
   <w:body>
     <w:tbl>
       <w:tblPr>
@@ -246,7 +246,6 @@
               <w:docPart w:val="E7E7E927A2094AC39DDC6A932D4AA851"/>
             </w:placeholder>
           </w:sdtPr>
-          <w:sdtEndPr/>
           <w:sdtContent>
             <w:tc>
               <w:tcPr>
@@ -382,7 +381,6 @@
               <w:docPart w:val="6A8A996FEC314FAEBC0A8320051A9866"/>
             </w:placeholder>
           </w:sdtPr>
-          <w:sdtEndPr/>
           <w:sdtContent>
             <w:tc>
               <w:tcPr>
@@ -403,7 +401,15 @@
                     <w:sz w:val="16"/>
                     <w:szCs w:val="16"/>
                   </w:rPr>
-                  <w:t>SBP-BRIMS 2022</w:t>
+                  <w:t>SBP-BRIMS 202</w:t>
+                </w:r>
+                <w:r>
+                  <w:rPr>
+                    <w:rFonts w:ascii="Tahoma" w:eastAsia="Cambria" w:hAnsi="Tahoma" w:cs="Tahoma"/>
+                    <w:sz w:val="16"/>
+                    <w:szCs w:val="16"/>
+                  </w:rPr>
+                  <w:t>5</w:t>
                 </w:r>
               </w:p>
             </w:tc>
@@ -535,7 +541,6 @@
               <w:docPart w:val="D396DE6BAAE04F078FD6EECA6106629A"/>
             </w:placeholder>
           </w:sdtPr>
-          <w:sdtEndPr/>
           <w:sdtContent>
             <w:tc>
               <w:tcPr>
@@ -556,43 +561,7 @@
                     <w:sz w:val="16"/>
                     <w:szCs w:val="16"/>
                   </w:rPr>
-                  <w:t xml:space="preserve">Robert </w:t>
-                </w:r>
-                <w:proofErr w:type="spellStart"/>
-                <w:r>
-                  <w:rPr>
-                    <w:rFonts w:ascii="Tahoma" w:eastAsia="Cambria" w:hAnsi="Tahoma" w:cs="Tahoma"/>
-                    <w:sz w:val="16"/>
-                    <w:szCs w:val="16"/>
-                  </w:rPr>
-                  <w:t>Thomsn</w:t>
-                </w:r>
-                <w:proofErr w:type="spellEnd"/>
-                <w:r>
-                  <w:rPr>
-                    <w:rFonts w:ascii="Tahoma" w:eastAsia="Cambria" w:hAnsi="Tahoma" w:cs="Tahoma"/>
-                    <w:sz w:val="16"/>
-                    <w:szCs w:val="16"/>
-                  </w:rPr>
-                  <w:t xml:space="preserve">, </w:t>
-                </w:r>
-                <w:proofErr w:type="spellStart"/>
-                <w:r>
-                  <w:rPr>
-                    <w:rFonts w:ascii="Tahoma" w:eastAsia="Cambria" w:hAnsi="Tahoma" w:cs="Tahoma"/>
-                    <w:sz w:val="16"/>
-                    <w:szCs w:val="16"/>
-                  </w:rPr>
-                  <w:t>Christoper</w:t>
-                </w:r>
-                <w:proofErr w:type="spellEnd"/>
-                <w:r>
-                  <w:rPr>
-                    <w:rFonts w:ascii="Tahoma" w:eastAsia="Cambria" w:hAnsi="Tahoma" w:cs="Tahoma"/>
-                    <w:sz w:val="16"/>
-                    <w:szCs w:val="16"/>
-                  </w:rPr>
-                  <w:t xml:space="preserve"> L Dancy, and Aryn Pyke</w:t>
+                  <w:t>Add names of the volume editors here.</w:t>
                 </w:r>
               </w:p>
             </w:tc>
@@ -700,7 +669,6 @@
             </w:placeholder>
             <w:showingPlcHdr/>
           </w:sdtPr>
-          <w:sdtEndPr/>
           <w:sdtContent>
             <w:tc>
               <w:tcPr>
@@ -1000,7 +968,6 @@
             </w:placeholder>
             <w:showingPlcHdr/>
           </w:sdtPr>
-          <w:sdtEndPr/>
           <w:sdtContent>
             <w:tc>
               <w:tcPr>
@@ -1241,7 +1208,6 @@
             </w:placeholder>
             <w:showingPlcHdr/>
           </w:sdtPr>
-          <w:sdtEndPr/>
           <w:sdtContent>
             <w:tc>
               <w:tcPr>
@@ -1841,7 +1807,29 @@
           <w:szCs w:val="20"/>
           <w:lang w:eastAsia="en-GB"/>
         </w:rPr>
-        <w:t xml:space="preserve"> will include an acknowledgement and provide a link to the Version of Record on the publisher’s website: “This preprint has not undergone peer review (when applicable) or any post-submission improvements or corrections. The Version of Record of this contribution is published in [insert volume title], and is available online at </w:t>
+        <w:t xml:space="preserve"> will include an acknowledgement and provide a link to the Version of Record on the publisher’s website: “This preprint has not undergone peer review (when applicable) or any post-submission improvements or corrections. The Version of Record of this contribution is published in [insert volume title</w:t>
+      </w:r>
+      <w:proofErr w:type="gramStart"/>
+      <w:r>
+        <w:rPr>
+          <w:rFonts w:ascii="Tahoma" w:eastAsia="Arial" w:hAnsi="Tahoma" w:cs="Tahoma"/>
+          <w:bCs/>
+          <w:sz w:val="20"/>
+          <w:szCs w:val="20"/>
+          <w:lang w:eastAsia="en-GB"/>
+        </w:rPr>
+        <w:t>], and</w:t>
+      </w:r>
+      <w:proofErr w:type="gramEnd"/>
+      <w:r>
+        <w:rPr>
+          <w:rFonts w:ascii="Tahoma" w:eastAsia="Arial" w:hAnsi="Tahoma" w:cs="Tahoma"/>
+          <w:bCs/>
+          <w:sz w:val="20"/>
+          <w:szCs w:val="20"/>
+          <w:lang w:eastAsia="en-GB"/>
+        </w:rPr>
+        <w:t xml:space="preserve"> is available online at </w:t>
       </w:r>
       <w:proofErr w:type="gramStart"/>
       <w:r>
@@ -2521,7 +2509,29 @@
           <w:szCs w:val="20"/>
           <w:lang w:eastAsia="en-GB"/>
         </w:rPr>
-        <w:t xml:space="preserve"> rights) or other third party rights and no licence from or payments to a third party are required to publish the Contribution,</w:t>
+        <w:t xml:space="preserve"> rights) or other </w:t>
+      </w:r>
+      <w:proofErr w:type="gramStart"/>
+      <w:r>
+        <w:rPr>
+          <w:rFonts w:ascii="Tahoma" w:eastAsia="Arial" w:hAnsi="Tahoma" w:cs="Tahoma"/>
+          <w:bCs/>
+          <w:sz w:val="20"/>
+          <w:szCs w:val="20"/>
+          <w:lang w:eastAsia="en-GB"/>
+        </w:rPr>
+        <w:t>third party</w:t>
+      </w:r>
+      <w:proofErr w:type="gramEnd"/>
+      <w:r>
+        <w:rPr>
+          <w:rFonts w:ascii="Tahoma" w:eastAsia="Arial" w:hAnsi="Tahoma" w:cs="Tahoma"/>
+          <w:bCs/>
+          <w:sz w:val="20"/>
+          <w:szCs w:val="20"/>
+          <w:lang w:eastAsia="en-GB"/>
+        </w:rPr>
+        <w:t xml:space="preserve"> rights and no licence from or payments to a third party are required to publish the Contribution,</w:t>
       </w:r>
     </w:p>
     <w:p>
@@ -2577,29 +2587,7 @@
           <w:szCs w:val="20"/>
           <w:lang w:eastAsia="en-GB"/>
         </w:rPr>
-        <w:t>if the Contribution contains materials from other sources (</w:t>
-      </w:r>
-      <w:proofErr w:type="gramStart"/>
-      <w:r>
-        <w:rPr>
-          <w:rFonts w:ascii="Tahoma" w:eastAsia="Arial" w:hAnsi="Tahoma" w:cs="Tahoma"/>
-          <w:bCs/>
-          <w:sz w:val="20"/>
-          <w:szCs w:val="20"/>
-          <w:lang w:eastAsia="en-GB"/>
-        </w:rPr>
-        <w:t>e.g.</w:t>
-      </w:r>
-      <w:proofErr w:type="gramEnd"/>
-      <w:r>
-        <w:rPr>
-          <w:rFonts w:ascii="Tahoma" w:eastAsia="Arial" w:hAnsi="Tahoma" w:cs="Tahoma"/>
-          <w:bCs/>
-          <w:sz w:val="20"/>
-          <w:szCs w:val="20"/>
-          <w:lang w:eastAsia="en-GB"/>
-        </w:rPr>
-        <w:t xml:space="preserve"> illustrations, tables, text quotations), Author has obtained written permissions to the extent necessary from the copyright holder(s), to license to the Licensee the same rights as set out in clause 1 </w:t>
+        <w:t xml:space="preserve">if the Contribution contains materials from other sources (e.g. illustrations, tables, text quotations), Author has obtained written permissions to the extent necessary from the copyright holder(s), to license to the Licensee the same rights as set out in clause 1 </w:t>
       </w:r>
       <w:r>
         <w:rPr>
@@ -2640,15 +2628,27 @@
           <w:lang w:eastAsia="en-GB"/>
         </w:rPr>
       </w:pPr>
-      <w:r>
-        <w:rPr>
-          <w:rFonts w:ascii="Tahoma" w:eastAsia="Arial" w:hAnsi="Tahoma" w:cs="Tahoma"/>
-          <w:bCs/>
-          <w:sz w:val="20"/>
-          <w:szCs w:val="20"/>
-          <w:lang w:eastAsia="en-GB"/>
-        </w:rPr>
-        <w:t xml:space="preserve">all of the facts contained in the Contribution are according to the current body of research true and </w:t>
+      <w:proofErr w:type="gramStart"/>
+      <w:r>
+        <w:rPr>
+          <w:rFonts w:ascii="Tahoma" w:eastAsia="Arial" w:hAnsi="Tahoma" w:cs="Tahoma"/>
+          <w:bCs/>
+          <w:sz w:val="20"/>
+          <w:szCs w:val="20"/>
+          <w:lang w:eastAsia="en-GB"/>
+        </w:rPr>
+        <w:t>all of</w:t>
+      </w:r>
+      <w:proofErr w:type="gramEnd"/>
+      <w:r>
+        <w:rPr>
+          <w:rFonts w:ascii="Tahoma" w:eastAsia="Arial" w:hAnsi="Tahoma" w:cs="Tahoma"/>
+          <w:bCs/>
+          <w:sz w:val="20"/>
+          <w:szCs w:val="20"/>
+          <w:lang w:eastAsia="en-GB"/>
+        </w:rPr>
+        <w:t xml:space="preserve"> the facts contained in the Contribution are according to the current body of research true and </w:t>
       </w:r>
       <w:proofErr w:type="gramStart"/>
       <w:r>
@@ -2868,7 +2868,7 @@
           <w:szCs w:val="20"/>
           <w:lang w:eastAsia="en-GB"/>
         </w:rPr>
-        <w:t xml:space="preserve">the signatory who has signed this Agreement has full right, </w:t>
+        <w:t xml:space="preserve">the signatory who has signed this Agreement has full right, power and authority to enter into this Agreement on behalf of </w:t>
       </w:r>
       <w:proofErr w:type="gramStart"/>
       <w:r>
@@ -2879,7 +2879,7 @@
           <w:szCs w:val="20"/>
           <w:lang w:eastAsia="en-GB"/>
         </w:rPr>
-        <w:t>power</w:t>
+        <w:t>all of</w:t>
       </w:r>
       <w:proofErr w:type="gramEnd"/>
       <w:r>
@@ -2890,7 +2890,7 @@
           <w:szCs w:val="20"/>
           <w:lang w:eastAsia="en-GB"/>
         </w:rPr>
-        <w:t xml:space="preserve"> and authority to enter into this Agreement on behalf of all of the Authors</w:t>
+        <w:t xml:space="preserve"> the Authors</w:t>
       </w:r>
       <w:r>
         <w:rPr>
@@ -4408,7 +4408,7 @@
 </file>
 
 <file path=word/endnotes.xml><?xml version="1.0" encoding="utf-8"?>
-<w:endnotes xmlns:wpc="http://schemas.microsoft.com/office/word/2010/wordprocessingCanvas" xmlns:cx="http://schemas.microsoft.com/office/drawing/2014/chartex" xmlns:cx1="http://schemas.microsoft.com/office/drawing/2015/9/8/chartex" xmlns:cx2="http://schemas.microsoft.com/office/drawing/2015/10/21/chartex" xmlns:cx3="http://schemas.microsoft.com/office/drawing/2016/5/9/chartex" xmlns:cx4="http://schemas.microsoft.com/office/drawing/2016/5/10/chartex" xmlns:cx5="http://schemas.microsoft.com/office/drawing/2016/5/11/chartex" xmlns:cx6="http://schemas.microsoft.com/office/drawing/2016/5/12/chartex" xmlns:cx7="http://schemas.microsoft.com/office/drawing/2016/5/13/chartex" xmlns:cx8="http://schemas.microsoft.com/office/drawing/2016/5/14/chartex" xmlns:mc="http://schemas.openxmlformats.org/markup-compatibility/2006" xmlns:aink="http://schemas.microsoft.com/office/drawing/2016/ink" xmlns:am3d="http://schemas.microsoft.com/office/drawing/2017/model3d" xmlns:o="urn:schemas-microsoft-com:office:office" xmlns:oel="http://schemas.microsoft.com/office/2019/extlst" xmlns:r="http://schemas.openxmlformats.org/officeDocument/2006/relationships" xmlns:m="http://schemas.openxmlformats.org/officeDocument/2006/math" xmlns:v="urn:schemas-microsoft-com:vml" xmlns:wp14="http://schemas.microsoft.com/office/word/2010/wordprocessingDrawing" xmlns:wp="http://schemas.openxmlformats.org/drawingml/2006/wordprocessingDrawing" xmlns:w10="urn:schemas-microsoft-com:office:word" xmlns:w="http://schemas.openxmlformats.org/wordprocessingml/2006/main" xmlns:w14="http://schemas.microsoft.com/office/word/2010/wordml" xmlns:w15="http://schemas.microsoft.com/office/word/2012/wordml" xmlns:w16cex="http://schemas.microsoft.com/office/word/2018/wordml/cex" xmlns:w16cid="http://schemas.microsoft.com/office/word/2016/wordml/cid" xmlns:w16="http://schemas.microsoft.com/office/word/2018/wordml" xmlns:w16sdtdh="http://schemas.microsoft.com/office/word/2020/wordml/sdtdatahash" xmlns:w16se="http://schemas.microsoft.com/office/word/2015/wordml/symex" xmlns:wpg="http://schemas.microsoft.com/office/word/2010/wordprocessingGroup" xmlns:wpi="http://schemas.microsoft.com/office/word/2010/wordprocessingInk" xmlns:wne="http://schemas.microsoft.com/office/word/2006/wordml" xmlns:wps="http://schemas.microsoft.com/office/word/2010/wordprocessingShape" mc:Ignorable="w14 w15 w16se w16cid w16 w16cex w16sdtdh wp14">
+<w:endnotes xmlns:wpc="http://schemas.microsoft.com/office/word/2010/wordprocessingCanvas" xmlns:cx="http://schemas.microsoft.com/office/drawing/2014/chartex" xmlns:cx1="http://schemas.microsoft.com/office/drawing/2015/9/8/chartex" xmlns:cx2="http://schemas.microsoft.com/office/drawing/2015/10/21/chartex" xmlns:cx3="http://schemas.microsoft.com/office/drawing/2016/5/9/chartex" xmlns:cx4="http://schemas.microsoft.com/office/drawing/2016/5/10/chartex" xmlns:cx5="http://schemas.microsoft.com/office/drawing/2016/5/11/chartex" xmlns:cx6="http://schemas.microsoft.com/office/drawing/2016/5/12/chartex" xmlns:cx7="http://schemas.microsoft.com/office/drawing/2016/5/13/chartex" xmlns:cx8="http://schemas.microsoft.com/office/drawing/2016/5/14/chartex" xmlns:mc="http://schemas.openxmlformats.org/markup-compatibility/2006" xmlns:aink="http://schemas.microsoft.com/office/drawing/2016/ink" xmlns:am3d="http://schemas.microsoft.com/office/drawing/2017/model3d" xmlns:o="urn:schemas-microsoft-com:office:office" xmlns:oel="http://schemas.microsoft.com/office/2019/extlst" xmlns:r="http://schemas.openxmlformats.org/officeDocument/2006/relationships" xmlns:m="http://schemas.openxmlformats.org/officeDocument/2006/math" xmlns:v="urn:schemas-microsoft-com:vml" xmlns:wp14="http://schemas.microsoft.com/office/word/2010/wordprocessingDrawing" xmlns:wp="http://schemas.openxmlformats.org/drawingml/2006/wordprocessingDrawing" xmlns:w10="urn:schemas-microsoft-com:office:word" xmlns:w="http://schemas.openxmlformats.org/wordprocessingml/2006/main" xmlns:w14="http://schemas.microsoft.com/office/word/2010/wordml" xmlns:w15="http://schemas.microsoft.com/office/word/2012/wordml" xmlns:w16cex="http://schemas.microsoft.com/office/word/2018/wordml/cex" xmlns:w16cid="http://schemas.microsoft.com/office/word/2016/wordml/cid" xmlns:w16="http://schemas.microsoft.com/office/word/2018/wordml" xmlns:w16du="http://schemas.microsoft.com/office/word/2023/wordml/word16du" xmlns:w16sdtdh="http://schemas.microsoft.com/office/word/2020/wordml/sdtdatahash" xmlns:w16sdtfl="http://schemas.microsoft.com/office/word/2024/wordml/sdtformatlock" xmlns:w16se="http://schemas.microsoft.com/office/word/2015/wordml/symex" xmlns:wpg="http://schemas.microsoft.com/office/word/2010/wordprocessingGroup" xmlns:wpi="http://schemas.microsoft.com/office/word/2010/wordprocessingInk" xmlns:wne="http://schemas.microsoft.com/office/word/2006/wordml" xmlns:wps="http://schemas.microsoft.com/office/word/2010/wordprocessingShape" mc:Ignorable="w14 w15 w16se w16cid w16 w16cex w16sdtdh w16sdtfl w16du wp14">
   <w:endnote w:type="separator" w:id="-1">
     <w:p>
       <w:pPr>
@@ -4433,7 +4433,7 @@
 </file>
 
 <file path=word/footer1.xml><?xml version="1.0" encoding="utf-8"?>
-<w:ftr xmlns:wpc="http://schemas.microsoft.com/office/word/2010/wordprocessingCanvas" xmlns:cx="http://schemas.microsoft.com/office/drawing/2014/chartex" xmlns:cx1="http://schemas.microsoft.com/office/drawing/2015/9/8/chartex" xmlns:cx2="http://schemas.microsoft.com/office/drawing/2015/10/21/chartex" xmlns:cx3="http://schemas.microsoft.com/office/drawing/2016/5/9/chartex" xmlns:cx4="http://schemas.microsoft.com/office/drawing/2016/5/10/chartex" xmlns:cx5="http://schemas.microsoft.com/office/drawing/2016/5/11/chartex" xmlns:cx6="http://schemas.microsoft.com/office/drawing/2016/5/12/chartex" xmlns:cx7="http://schemas.microsoft.com/office/drawing/2016/5/13/chartex" xmlns:cx8="http://schemas.microsoft.com/office/drawing/2016/5/14/chartex" xmlns:mc="http://schemas.openxmlformats.org/markup-compatibility/2006" xmlns:aink="http://schemas.microsoft.com/office/drawing/2016/ink" xmlns:am3d="http://schemas.microsoft.com/office/drawing/2017/model3d" xmlns:o="urn:schemas-microsoft-com:office:office" xmlns:oel="http://schemas.microsoft.com/office/2019/extlst" xmlns:r="http://schemas.openxmlformats.org/officeDocument/2006/relationships" xmlns:m="http://schemas.openxmlformats.org/officeDocument/2006/math" xmlns:v="urn:schemas-microsoft-com:vml" xmlns:wp14="http://schemas.microsoft.com/office/word/2010/wordprocessingDrawing" xmlns:wp="http://schemas.openxmlformats.org/drawingml/2006/wordprocessingDrawing" xmlns:w10="urn:schemas-microsoft-com:office:word" xmlns:w="http://schemas.openxmlformats.org/wordprocessingml/2006/main" xmlns:w14="http://schemas.microsoft.com/office/word/2010/wordml" xmlns:w15="http://schemas.microsoft.com/office/word/2012/wordml" xmlns:w16cex="http://schemas.microsoft.com/office/word/2018/wordml/cex" xmlns:w16cid="http://schemas.microsoft.com/office/word/2016/wordml/cid" xmlns:w16="http://schemas.microsoft.com/office/word/2018/wordml" xmlns:w16sdtdh="http://schemas.microsoft.com/office/word/2020/wordml/sdtdatahash" xmlns:w16se="http://schemas.microsoft.com/office/word/2015/wordml/symex" xmlns:wpg="http://schemas.microsoft.com/office/word/2010/wordprocessingGroup" xmlns:wpi="http://schemas.microsoft.com/office/word/2010/wordprocessingInk" xmlns:wne="http://schemas.microsoft.com/office/word/2006/wordml" xmlns:wps="http://schemas.microsoft.com/office/word/2010/wordprocessingShape" mc:Ignorable="w14 w15 w16se w16cid w16 w16cex w16sdtdh wp14">
+<w:ftr xmlns:wpc="http://schemas.microsoft.com/office/word/2010/wordprocessingCanvas" xmlns:cx="http://schemas.microsoft.com/office/drawing/2014/chartex" xmlns:cx1="http://schemas.microsoft.com/office/drawing/2015/9/8/chartex" xmlns:cx2="http://schemas.microsoft.com/office/drawing/2015/10/21/chartex" xmlns:cx3="http://schemas.microsoft.com/office/drawing/2016/5/9/chartex" xmlns:cx4="http://schemas.microsoft.com/office/drawing/2016/5/10/chartex" xmlns:cx5="http://schemas.microsoft.com/office/drawing/2016/5/11/chartex" xmlns:cx6="http://schemas.microsoft.com/office/drawing/2016/5/12/chartex" xmlns:cx7="http://schemas.microsoft.com/office/drawing/2016/5/13/chartex" xmlns:cx8="http://schemas.microsoft.com/office/drawing/2016/5/14/chartex" xmlns:mc="http://schemas.openxmlformats.org/markup-compatibility/2006" xmlns:aink="http://schemas.microsoft.com/office/drawing/2016/ink" xmlns:am3d="http://schemas.microsoft.com/office/drawing/2017/model3d" xmlns:o="urn:schemas-microsoft-com:office:office" xmlns:oel="http://schemas.microsoft.com/office/2019/extlst" xmlns:r="http://schemas.openxmlformats.org/officeDocument/2006/relationships" xmlns:m="http://schemas.openxmlformats.org/officeDocument/2006/math" xmlns:v="urn:schemas-microsoft-com:vml" xmlns:wp14="http://schemas.microsoft.com/office/word/2010/wordprocessingDrawing" xmlns:wp="http://schemas.openxmlformats.org/drawingml/2006/wordprocessingDrawing" xmlns:w10="urn:schemas-microsoft-com:office:word" xmlns:w="http://schemas.openxmlformats.org/wordprocessingml/2006/main" xmlns:w14="http://schemas.microsoft.com/office/word/2010/wordml" xmlns:w15="http://schemas.microsoft.com/office/word/2012/wordml" xmlns:w16cex="http://schemas.microsoft.com/office/word/2018/wordml/cex" xmlns:w16cid="http://schemas.microsoft.com/office/word/2016/wordml/cid" xmlns:w16="http://schemas.microsoft.com/office/word/2018/wordml" xmlns:w16du="http://schemas.microsoft.com/office/word/2023/wordml/word16du" xmlns:w16sdtdh="http://schemas.microsoft.com/office/word/2020/wordml/sdtdatahash" xmlns:w16sdtfl="http://schemas.microsoft.com/office/word/2024/wordml/sdtformatlock" xmlns:w16se="http://schemas.microsoft.com/office/word/2015/wordml/symex" xmlns:wpg="http://schemas.microsoft.com/office/word/2010/wordprocessingGroup" xmlns:wpi="http://schemas.microsoft.com/office/word/2010/wordprocessingInk" xmlns:wne="http://schemas.microsoft.com/office/word/2006/wordml" xmlns:wps="http://schemas.microsoft.com/office/word/2010/wordprocessingShape" mc:Ignorable="w14 w15 w16se w16cid w16 w16cex w16sdtdh w16sdtfl w16du wp14">
   <w:sdt>
     <w:sdtPr>
       <w:rPr>
@@ -4446,7 +4446,6 @@
         <w:docPartUnique/>
       </w:docPartObj>
     </w:sdtPr>
-    <w:sdtEndPr/>
     <w:sdtContent>
       <w:sdt>
         <w:sdtPr>
@@ -4460,7 +4459,6 @@
             <w:docPartUnique/>
           </w:docPartObj>
         </w:sdtPr>
-        <w:sdtEndPr/>
         <w:sdtContent>
           <w:p>
             <w:pPr>
@@ -4581,7 +4579,7 @@
 </file>
 
 <file path=word/footnotes.xml><?xml version="1.0" encoding="utf-8"?>
-<w:footnotes xmlns:wpc="http://schemas.microsoft.com/office/word/2010/wordprocessingCanvas" xmlns:cx="http://schemas.microsoft.com/office/drawing/2014/chartex" xmlns:cx1="http://schemas.microsoft.com/office/drawing/2015/9/8/chartex" xmlns:cx2="http://schemas.microsoft.com/office/drawing/2015/10/21/chartex" xmlns:cx3="http://schemas.microsoft.com/office/drawing/2016/5/9/chartex" xmlns:cx4="http://schemas.microsoft.com/office/drawing/2016/5/10/chartex" xmlns:cx5="http://schemas.microsoft.com/office/drawing/2016/5/11/chartex" xmlns:cx6="http://schemas.microsoft.com/office/drawing/2016/5/12/chartex" xmlns:cx7="http://schemas.microsoft.com/office/drawing/2016/5/13/chartex" xmlns:cx8="http://schemas.microsoft.com/office/drawing/2016/5/14/chartex" xmlns:mc="http://schemas.openxmlformats.org/markup-compatibility/2006" xmlns:aink="http://schemas.microsoft.com/office/drawing/2016/ink" xmlns:am3d="http://schemas.microsoft.com/office/drawing/2017/model3d" xmlns:o="urn:schemas-microsoft-com:office:office" xmlns:oel="http://schemas.microsoft.com/office/2019/extlst" xmlns:r="http://schemas.openxmlformats.org/officeDocument/2006/relationships" xmlns:m="http://schemas.openxmlformats.org/officeDocument/2006/math" xmlns:v="urn:schemas-microsoft-com:vml" xmlns:wp14="http://schemas.microsoft.com/office/word/2010/wordprocessingDrawing" xmlns:wp="http://schemas.openxmlformats.org/drawingml/2006/wordprocessingDrawing" xmlns:w10="urn:schemas-microsoft-com:office:word" xmlns:w="http://schemas.openxmlformats.org/wordprocessingml/2006/main" xmlns:w14="http://schemas.microsoft.com/office/word/2010/wordml" xmlns:w15="http://schemas.microsoft.com/office/word/2012/wordml" xmlns:w16cex="http://schemas.microsoft.com/office/word/2018/wordml/cex" xmlns:w16cid="http://schemas.microsoft.com/office/word/2016/wordml/cid" xmlns:w16="http://schemas.microsoft.com/office/word/2018/wordml" xmlns:w16sdtdh="http://schemas.microsoft.com/office/word/2020/wordml/sdtdatahash" xmlns:w16se="http://schemas.microsoft.com/office/word/2015/wordml/symex" xmlns:wpg="http://schemas.microsoft.com/office/word/2010/wordprocessingGroup" xmlns:wpi="http://schemas.microsoft.com/office/word/2010/wordprocessingInk" xmlns:wne="http://schemas.microsoft.com/office/word/2006/wordml" xmlns:wps="http://schemas.microsoft.com/office/word/2010/wordprocessingShape" mc:Ignorable="w14 w15 w16se w16cid w16 w16cex w16sdtdh wp14">
+<w:footnotes xmlns:wpc="http://schemas.microsoft.com/office/word/2010/wordprocessingCanvas" xmlns:cx="http://schemas.microsoft.com/office/drawing/2014/chartex" xmlns:cx1="http://schemas.microsoft.com/office/drawing/2015/9/8/chartex" xmlns:cx2="http://schemas.microsoft.com/office/drawing/2015/10/21/chartex" xmlns:cx3="http://schemas.microsoft.com/office/drawing/2016/5/9/chartex" xmlns:cx4="http://schemas.microsoft.com/office/drawing/2016/5/10/chartex" xmlns:cx5="http://schemas.microsoft.com/office/drawing/2016/5/11/chartex" xmlns:cx6="http://schemas.microsoft.com/office/drawing/2016/5/12/chartex" xmlns:cx7="http://schemas.microsoft.com/office/drawing/2016/5/13/chartex" xmlns:cx8="http://schemas.microsoft.com/office/drawing/2016/5/14/chartex" xmlns:mc="http://schemas.openxmlformats.org/markup-compatibility/2006" xmlns:aink="http://schemas.microsoft.com/office/drawing/2016/ink" xmlns:am3d="http://schemas.microsoft.com/office/drawing/2017/model3d" xmlns:o="urn:schemas-microsoft-com:office:office" xmlns:oel="http://schemas.microsoft.com/office/2019/extlst" xmlns:r="http://schemas.openxmlformats.org/officeDocument/2006/relationships" xmlns:m="http://schemas.openxmlformats.org/officeDocument/2006/math" xmlns:v="urn:schemas-microsoft-com:vml" xmlns:wp14="http://schemas.microsoft.com/office/word/2010/wordprocessingDrawing" xmlns:wp="http://schemas.openxmlformats.org/drawingml/2006/wordprocessingDrawing" xmlns:w10="urn:schemas-microsoft-com:office:word" xmlns:w="http://schemas.openxmlformats.org/wordprocessingml/2006/main" xmlns:w14="http://schemas.microsoft.com/office/word/2010/wordml" xmlns:w15="http://schemas.microsoft.com/office/word/2012/wordml" xmlns:w16cex="http://schemas.microsoft.com/office/word/2018/wordml/cex" xmlns:w16cid="http://schemas.microsoft.com/office/word/2016/wordml/cid" xmlns:w16="http://schemas.microsoft.com/office/word/2018/wordml" xmlns:w16du="http://schemas.microsoft.com/office/word/2023/wordml/word16du" xmlns:w16sdtdh="http://schemas.microsoft.com/office/word/2020/wordml/sdtdatahash" xmlns:w16sdtfl="http://schemas.microsoft.com/office/word/2024/wordml/sdtformatlock" xmlns:w16se="http://schemas.microsoft.com/office/word/2015/wordml/symex" xmlns:wpg="http://schemas.microsoft.com/office/word/2010/wordprocessingGroup" xmlns:wpi="http://schemas.microsoft.com/office/word/2010/wordprocessingInk" xmlns:wne="http://schemas.microsoft.com/office/word/2006/wordml" xmlns:wps="http://schemas.microsoft.com/office/word/2010/wordprocessingShape" mc:Ignorable="w14 w15 w16se w16cid w16 w16cex w16sdtdh w16sdtfl w16du wp14">
   <w:footnote w:type="separator" w:id="-1">
     <w:p>
       <w:pPr>
@@ -4606,7 +4604,7 @@
 </file>
 
 <file path=word/numbering.xml><?xml version="1.0" encoding="utf-8"?>
-<w:numbering xmlns:wpc="http://schemas.microsoft.com/office/word/2010/wordprocessingCanvas" xmlns:cx="http://schemas.microsoft.com/office/drawing/2014/chartex" xmlns:cx1="http://schemas.microsoft.com/office/drawing/2015/9/8/chartex" xmlns:cx2="http://schemas.microsoft.com/office/drawing/2015/10/21/chartex" xmlns:cx3="http://schemas.microsoft.com/office/drawing/2016/5/9/chartex" xmlns:cx4="http://schemas.microsoft.com/office/drawing/2016/5/10/chartex" xmlns:cx5="http://schemas.microsoft.com/office/drawing/2016/5/11/chartex" xmlns:cx6="http://schemas.microsoft.com/office/drawing/2016/5/12/chartex" xmlns:cx7="http://schemas.microsoft.com/office/drawing/2016/5/13/chartex" xmlns:cx8="http://schemas.microsoft.com/office/drawing/2016/5/14/chartex" xmlns:mc="http://schemas.openxmlformats.org/markup-compatibility/2006" xmlns:aink="http://schemas.microsoft.com/office/drawing/2016/ink" xmlns:am3d="http://schemas.microsoft.com/office/drawing/2017/model3d" xmlns:o="urn:schemas-microsoft-com:office:office" xmlns:oel="http://schemas.microsoft.com/office/2019/extlst" xmlns:r="http://schemas.openxmlformats.org/officeDocument/2006/relationships" xmlns:m="http://schemas.openxmlformats.org/officeDocument/2006/math" xmlns:v="urn:schemas-microsoft-com:vml" xmlns:wp14="http://schemas.microsoft.com/office/word/2010/wordprocessingDrawing" xmlns:wp="http://schemas.openxmlformats.org/drawingml/2006/wordprocessingDrawing" xmlns:w10="urn:schemas-microsoft-com:office:word" xmlns:w="http://schemas.openxmlformats.org/wordprocessingml/2006/main" xmlns:w14="http://schemas.microsoft.com/office/word/2010/wordml" xmlns:w15="http://schemas.microsoft.com/office/word/2012/wordml" xmlns:w16cex="http://schemas.microsoft.com/office/word/2018/wordml/cex" xmlns:w16cid="http://schemas.microsoft.com/office/word/2016/wordml/cid" xmlns:w16="http://schemas.microsoft.com/office/word/2018/wordml" xmlns:w16sdtdh="http://schemas.microsoft.com/office/word/2020/wordml/sdtdatahash" xmlns:w16se="http://schemas.microsoft.com/office/word/2015/wordml/symex" xmlns:wpg="http://schemas.microsoft.com/office/word/2010/wordprocessingGroup" xmlns:wpi="http://schemas.microsoft.com/office/word/2010/wordprocessingInk" xmlns:wne="http://schemas.microsoft.com/office/word/2006/wordml" xmlns:wps="http://schemas.microsoft.com/office/word/2010/wordprocessingShape" mc:Ignorable="w14 w15 w16se w16cid w16 w16cex w16sdtdh wp14">
+<w:numbering xmlns:wpc="http://schemas.microsoft.com/office/word/2010/wordprocessingCanvas" xmlns:cx="http://schemas.microsoft.com/office/drawing/2014/chartex" xmlns:cx1="http://schemas.microsoft.com/office/drawing/2015/9/8/chartex" xmlns:cx2="http://schemas.microsoft.com/office/drawing/2015/10/21/chartex" xmlns:cx3="http://schemas.microsoft.com/office/drawing/2016/5/9/chartex" xmlns:cx4="http://schemas.microsoft.com/office/drawing/2016/5/10/chartex" xmlns:cx5="http://schemas.microsoft.com/office/drawing/2016/5/11/chartex" xmlns:cx6="http://schemas.microsoft.com/office/drawing/2016/5/12/chartex" xmlns:cx7="http://schemas.microsoft.com/office/drawing/2016/5/13/chartex" xmlns:cx8="http://schemas.microsoft.com/office/drawing/2016/5/14/chartex" xmlns:mc="http://schemas.openxmlformats.org/markup-compatibility/2006" xmlns:aink="http://schemas.microsoft.com/office/drawing/2016/ink" xmlns:am3d="http://schemas.microsoft.com/office/drawing/2017/model3d" xmlns:o="urn:schemas-microsoft-com:office:office" xmlns:oel="http://schemas.microsoft.com/office/2019/extlst" xmlns:r="http://schemas.openxmlformats.org/officeDocument/2006/relationships" xmlns:m="http://schemas.openxmlformats.org/officeDocument/2006/math" xmlns:v="urn:schemas-microsoft-com:vml" xmlns:wp14="http://schemas.microsoft.com/office/word/2010/wordprocessingDrawing" xmlns:wp="http://schemas.openxmlformats.org/drawingml/2006/wordprocessingDrawing" xmlns:w10="urn:schemas-microsoft-com:office:word" xmlns:w="http://schemas.openxmlformats.org/wordprocessingml/2006/main" xmlns:w14="http://schemas.microsoft.com/office/word/2010/wordml" xmlns:w15="http://schemas.microsoft.com/office/word/2012/wordml" xmlns:w16cex="http://schemas.microsoft.com/office/word/2018/wordml/cex" xmlns:w16cid="http://schemas.microsoft.com/office/word/2016/wordml/cid" xmlns:w16="http://schemas.microsoft.com/office/word/2018/wordml" xmlns:w16du="http://schemas.microsoft.com/office/word/2023/wordml/word16du" xmlns:w16sdtdh="http://schemas.microsoft.com/office/word/2020/wordml/sdtdatahash" xmlns:w16sdtfl="http://schemas.microsoft.com/office/word/2024/wordml/sdtformatlock" xmlns:w16se="http://schemas.microsoft.com/office/word/2015/wordml/symex" xmlns:wpg="http://schemas.microsoft.com/office/word/2010/wordprocessingGroup" xmlns:wpi="http://schemas.microsoft.com/office/word/2010/wordprocessingInk" xmlns:wne="http://schemas.microsoft.com/office/word/2006/wordml" xmlns:wps="http://schemas.microsoft.com/office/word/2010/wordprocessingShape" mc:Ignorable="w14 w15 w16se w16cid w16 w16cex w16sdtdh w16sdtfl w16du wp14">
   <w:abstractNum w:abstractNumId="0" w15:restartNumberingAfterBreak="0">
     <w:nsid w:val="345E38F9"/>
     <w:multiLevelType w:val="multilevel"/>
@@ -5204,7 +5202,7 @@
 </file>
 
 <file path=word/styles.xml><?xml version="1.0" encoding="utf-8"?>
-<w:styles xmlns:mc="http://schemas.openxmlformats.org/markup-compatibility/2006" xmlns:r="http://schemas.openxmlformats.org/officeDocument/2006/relationships" xmlns:w="http://schemas.openxmlformats.org/wordprocessingml/2006/main" xmlns:w14="http://schemas.microsoft.com/office/word/2010/wordml" xmlns:w15="http://schemas.microsoft.com/office/word/2012/wordml" xmlns:w16cex="http://schemas.microsoft.com/office/word/2018/wordml/cex" xmlns:w16cid="http://schemas.microsoft.com/office/word/2016/wordml/cid" xmlns:w16="http://schemas.microsoft.com/office/word/2018/wordml" xmlns:w16sdtdh="http://schemas.microsoft.com/office/word/2020/wordml/sdtdatahash" xmlns:w16se="http://schemas.microsoft.com/office/word/2015/wordml/symex" mc:Ignorable="w14 w15 w16se w16cid w16 w16cex w16sdtdh">
+<w:styles xmlns:mc="http://schemas.openxmlformats.org/markup-compatibility/2006" xmlns:r="http://schemas.openxmlformats.org/officeDocument/2006/relationships" xmlns:w="http://schemas.openxmlformats.org/wordprocessingml/2006/main" xmlns:w14="http://schemas.microsoft.com/office/word/2010/wordml" xmlns:w15="http://schemas.microsoft.com/office/word/2012/wordml" xmlns:w16cex="http://schemas.microsoft.com/office/word/2018/wordml/cex" xmlns:w16cid="http://schemas.microsoft.com/office/word/2016/wordml/cid" xmlns:w16="http://schemas.microsoft.com/office/word/2018/wordml" xmlns:w16du="http://schemas.microsoft.com/office/word/2023/wordml/word16du" xmlns:w16sdtdh="http://schemas.microsoft.com/office/word/2020/wordml/sdtdatahash" xmlns:w16sdtfl="http://schemas.microsoft.com/office/word/2024/wordml/sdtformatlock" xmlns:w16se="http://schemas.microsoft.com/office/word/2015/wordml/symex" mc:Ignorable="w14 w15 w16se w16cid w16 w16cex w16sdtdh w16sdtfl w16du">
   <w:docDefaults>
     <w:rPrDefault>
       <w:rPr>
@@ -5326,6 +5324,7 @@
     <w:lsdException w:name="HTML Sample" w:semiHidden="1" w:unhideWhenUsed="1"/>
     <w:lsdException w:name="HTML Typewriter" w:semiHidden="1" w:unhideWhenUsed="1"/>
     <w:lsdException w:name="HTML Variable" w:semiHidden="1" w:unhideWhenUsed="1"/>
+    <w:lsdException w:name="Normal Table" w:semiHidden="1" w:unhideWhenUsed="1"/>
     <w:lsdException w:name="annotation subject" w:semiHidden="1" w:unhideWhenUsed="1"/>
     <w:lsdException w:name="No List" w:semiHidden="1" w:unhideWhenUsed="1"/>
     <w:lsdException w:name="Outline List 1" w:semiHidden="1" w:unhideWhenUsed="1"/>
@@ -5368,8 +5367,11 @@
     <w:lsdException w:name="Table Contemporary" w:semiHidden="1" w:unhideWhenUsed="1"/>
     <w:lsdException w:name="Table Elegant" w:semiHidden="1" w:unhideWhenUsed="1"/>
     <w:lsdException w:name="Table Professional" w:semiHidden="1" w:unhideWhenUsed="1"/>
+    <w:lsdException w:name="Table Subtle 1" w:semiHidden="1" w:unhideWhenUsed="1"/>
     <w:lsdException w:name="Table Subtle 2" w:semiHidden="1" w:unhideWhenUsed="1"/>
     <w:lsdException w:name="Table Web 1" w:semiHidden="1" w:unhideWhenUsed="1"/>
+    <w:lsdException w:name="Table Web 2" w:semiHidden="1" w:unhideWhenUsed="1"/>
+    <w:lsdException w:name="Table Web 3" w:semiHidden="1" w:unhideWhenUsed="1"/>
     <w:lsdException w:name="Balloon Text" w:semiHidden="1" w:unhideWhenUsed="1"/>
     <w:lsdException w:name="Table Grid" w:uiPriority="59"/>
     <w:lsdException w:name="Table Theme" w:semiHidden="1" w:unhideWhenUsed="1"/>
@@ -5935,7 +5937,7 @@
 </file>
 
 <file path=word/glossary/document.xml><?xml version="1.0" encoding="utf-8"?>
-<w:glossaryDocument xmlns:wpc="http://schemas.microsoft.com/office/word/2010/wordprocessingCanvas" xmlns:cx="http://schemas.microsoft.com/office/drawing/2014/chartex" xmlns:cx1="http://schemas.microsoft.com/office/drawing/2015/9/8/chartex" xmlns:cx2="http://schemas.microsoft.com/office/drawing/2015/10/21/chartex" xmlns:cx3="http://schemas.microsoft.com/office/drawing/2016/5/9/chartex" xmlns:cx4="http://schemas.microsoft.com/office/drawing/2016/5/10/chartex" xmlns:cx5="http://schemas.microsoft.com/office/drawing/2016/5/11/chartex" xmlns:cx6="http://schemas.microsoft.com/office/drawing/2016/5/12/chartex" xmlns:cx7="http://schemas.microsoft.com/office/drawing/2016/5/13/chartex" xmlns:cx8="http://schemas.microsoft.com/office/drawing/2016/5/14/chartex" xmlns:mc="http://schemas.openxmlformats.org/markup-compatibility/2006" xmlns:aink="http://schemas.microsoft.com/office/drawing/2016/ink" xmlns:am3d="http://schemas.microsoft.com/office/drawing/2017/model3d" xmlns:o="urn:schemas-microsoft-com:office:office" xmlns:oel="http://schemas.microsoft.com/office/2019/extlst" xmlns:r="http://schemas.openxmlformats.org/officeDocument/2006/relationships" xmlns:m="http://schemas.openxmlformats.org/officeDocument/2006/math" xmlns:v="urn:schemas-microsoft-com:vml" xmlns:wp14="http://schemas.microsoft.com/office/word/2010/wordprocessingDrawing" xmlns:wp="http://schemas.openxmlformats.org/drawingml/2006/wordprocessingDrawing" xmlns:w10="urn:schemas-microsoft-com:office:word" xmlns:w="http://schemas.openxmlformats.org/wordprocessingml/2006/main" xmlns:w14="http://schemas.microsoft.com/office/word/2010/wordml" xmlns:w15="http://schemas.microsoft.com/office/word/2012/wordml" xmlns:w16cex="http://schemas.microsoft.com/office/word/2018/wordml/cex" xmlns:w16cid="http://schemas.microsoft.com/office/word/2016/wordml/cid" xmlns:w16="http://schemas.microsoft.com/office/word/2018/wordml" xmlns:w16sdtdh="http://schemas.microsoft.com/office/word/2020/wordml/sdtdatahash" xmlns:w16se="http://schemas.microsoft.com/office/word/2015/wordml/symex" xmlns:wpg="http://schemas.microsoft.com/office/word/2010/wordprocessingGroup" xmlns:wpi="http://schemas.microsoft.com/office/word/2010/wordprocessingInk" xmlns:wne="http://schemas.microsoft.com/office/word/2006/wordml" xmlns:wps="http://schemas.microsoft.com/office/word/2010/wordprocessingShape" mc:Ignorable="w14 w15 w16se w16cid w16 w16cex w16sdtdh wp14">
+<w:glossaryDocument xmlns:wpc="http://schemas.microsoft.com/office/word/2010/wordprocessingCanvas" xmlns:cx="http://schemas.microsoft.com/office/drawing/2014/chartex" xmlns:cx1="http://schemas.microsoft.com/office/drawing/2015/9/8/chartex" xmlns:cx2="http://schemas.microsoft.com/office/drawing/2015/10/21/chartex" xmlns:cx3="http://schemas.microsoft.com/office/drawing/2016/5/9/chartex" xmlns:cx4="http://schemas.microsoft.com/office/drawing/2016/5/10/chartex" xmlns:cx5="http://schemas.microsoft.com/office/drawing/2016/5/11/chartex" xmlns:cx6="http://schemas.microsoft.com/office/drawing/2016/5/12/chartex" xmlns:cx7="http://schemas.microsoft.com/office/drawing/2016/5/13/chartex" xmlns:cx8="http://schemas.microsoft.com/office/drawing/2016/5/14/chartex" xmlns:mc="http://schemas.openxmlformats.org/markup-compatibility/2006" xmlns:aink="http://schemas.microsoft.com/office/drawing/2016/ink" xmlns:am3d="http://schemas.microsoft.com/office/drawing/2017/model3d" xmlns:o="urn:schemas-microsoft-com:office:office" xmlns:oel="http://schemas.microsoft.com/office/2019/extlst" xmlns:r="http://schemas.openxmlformats.org/officeDocument/2006/relationships" xmlns:m="http://schemas.openxmlformats.org/officeDocument/2006/math" xmlns:v="urn:schemas-microsoft-com:vml" xmlns:wp14="http://schemas.microsoft.com/office/word/2010/wordprocessingDrawing" xmlns:wp="http://schemas.openxmlformats.org/drawingml/2006/wordprocessingDrawing" xmlns:w10="urn:schemas-microsoft-com:office:word" xmlns:w="http://schemas.openxmlformats.org/wordprocessingml/2006/main" xmlns:w14="http://schemas.microsoft.com/office/word/2010/wordml" xmlns:w15="http://schemas.microsoft.com/office/word/2012/wordml" xmlns:w16cex="http://schemas.microsoft.com/office/word/2018/wordml/cex" xmlns:w16cid="http://schemas.microsoft.com/office/word/2016/wordml/cid" xmlns:w16="http://schemas.microsoft.com/office/word/2018/wordml" xmlns:w16du="http://schemas.microsoft.com/office/word/2023/wordml/word16du" xmlns:w16sdtdh="http://schemas.microsoft.com/office/word/2020/wordml/sdtdatahash" xmlns:w16sdtfl="http://schemas.microsoft.com/office/word/2024/wordml/sdtformatlock" xmlns:w16se="http://schemas.microsoft.com/office/word/2015/wordml/symex" xmlns:wpg="http://schemas.microsoft.com/office/word/2010/wordprocessingGroup" xmlns:wpi="http://schemas.microsoft.com/office/word/2010/wordprocessingInk" xmlns:wne="http://schemas.microsoft.com/office/word/2006/wordml" xmlns:wps="http://schemas.microsoft.com/office/word/2010/wordprocessingShape" mc:Ignorable="w14 w15 w16se w16cid w16 w16cex w16sdtdh w16sdtfl w16du wp14">
   <w:docParts>
     <w:docPart>
       <w:docPartPr>
@@ -6134,13 +6136,13 @@
 </file>
 
 <file path=word/glossary/fontTable.xml><?xml version="1.0" encoding="utf-8"?>
-<w:fonts xmlns:mc="http://schemas.openxmlformats.org/markup-compatibility/2006" xmlns:r="http://schemas.openxmlformats.org/officeDocument/2006/relationships" xmlns:w="http://schemas.openxmlformats.org/wordprocessingml/2006/main" xmlns:w14="http://schemas.microsoft.com/office/word/2010/wordml" xmlns:w15="http://schemas.microsoft.com/office/word/2012/wordml" xmlns:w16cex="http://schemas.microsoft.com/office/word/2018/wordml/cex" xmlns:w16cid="http://schemas.microsoft.com/office/word/2016/wordml/cid" xmlns:w16="http://schemas.microsoft.com/office/word/2018/wordml" xmlns:w16sdtdh="http://schemas.microsoft.com/office/word/2020/wordml/sdtdatahash" xmlns:w16se="http://schemas.microsoft.com/office/word/2015/wordml/symex" mc:Ignorable="w14 w15 w16se w16cid w16 w16cex w16sdtdh">
+<w:fonts xmlns:mc="http://schemas.openxmlformats.org/markup-compatibility/2006" xmlns:r="http://schemas.openxmlformats.org/officeDocument/2006/relationships" xmlns:w="http://schemas.openxmlformats.org/wordprocessingml/2006/main" xmlns:w14="http://schemas.microsoft.com/office/word/2010/wordml" xmlns:w15="http://schemas.microsoft.com/office/word/2012/wordml" xmlns:w16cex="http://schemas.microsoft.com/office/word/2018/wordml/cex" xmlns:w16cid="http://schemas.microsoft.com/office/word/2016/wordml/cid" xmlns:w16="http://schemas.microsoft.com/office/word/2018/wordml" xmlns:w16du="http://schemas.microsoft.com/office/word/2023/wordml/word16du" xmlns:w16sdtdh="http://schemas.microsoft.com/office/word/2020/wordml/sdtdatahash" xmlns:w16sdtfl="http://schemas.microsoft.com/office/word/2024/wordml/sdtformatlock" xmlns:w16se="http://schemas.microsoft.com/office/word/2015/wordml/symex" mc:Ignorable="w14 w15 w16se w16cid w16 w16cex w16sdtdh w16sdtfl w16du">
   <w:font w:name="Calibri">
     <w:panose1 w:val="020F0502020204030204"/>
     <w:charset w:val="00"/>
     <w:family w:val="swiss"/>
     <w:pitch w:val="variable"/>
-    <w:sig w:usb0="E4002EFF" w:usb1="C000247B" w:usb2="00000009" w:usb3="00000000" w:csb0="000001FF" w:csb1="00000000"/>
+    <w:sig w:usb0="E4002EFF" w:usb1="C200247B" w:usb2="00000009" w:usb3="00000000" w:csb0="000001FF" w:csb1="00000000"/>
   </w:font>
   <w:font w:name="Times New Roman">
     <w:panose1 w:val="02020603050405020304"/>
@@ -6161,7 +6163,7 @@
     <w:charset w:val="00"/>
     <w:family w:val="swiss"/>
     <w:pitch w:val="variable"/>
-    <w:sig w:usb0="E0002EFF" w:usb1="C000785B" w:usb2="00000009" w:usb3="00000000" w:csb0="000001FF" w:csb1="00000000"/>
+    <w:sig w:usb0="E0002AFF" w:usb1="C0007843" w:usb2="00000009" w:usb3="00000000" w:csb0="000001FF" w:csb1="00000000"/>
   </w:font>
   <w:font w:name="Segoe UI">
     <w:panose1 w:val="020B0502040204020203"/>
@@ -6182,10 +6184,10 @@
     <w:charset w:val="00"/>
     <w:family w:val="swiss"/>
     <w:pitch w:val="variable"/>
-    <w:sig w:usb0="E4002EFF" w:usb1="C000247B" w:usb2="00000009" w:usb3="00000000" w:csb0="000001FF" w:csb1="00000000"/>
+    <w:sig w:usb0="E0002AFF" w:usb1="C000247B" w:usb2="00000009" w:usb3="00000000" w:csb0="000001FF" w:csb1="00000000"/>
   </w:font>
   <w:font w:name="DengXian Light">
-    <w:altName w:val="等线 Light"/>
+    <w:panose1 w:val="02010600030101010101"/>
     <w:charset w:val="86"/>
     <w:family w:val="auto"/>
     <w:pitch w:val="variable"/>
@@ -6199,11 +6201,25 @@
     <w:pitch w:val="variable"/>
     <w:sig w:usb0="A00002BF" w:usb1="38CF7CFA" w:usb2="00000016" w:usb3="00000000" w:csb0="0004000F" w:csb1="00000000"/>
   </w:font>
+  <w:font w:name="Aptos">
+    <w:panose1 w:val="020B0004020202020204"/>
+    <w:charset w:val="00"/>
+    <w:family w:val="swiss"/>
+    <w:pitch w:val="variable"/>
+    <w:sig w:usb0="20000287" w:usb1="00000003" w:usb2="00000000" w:usb3="00000000" w:csb0="0000019F" w:csb1="00000000"/>
+  </w:font>
+  <w:font w:name="Aptos Display">
+    <w:panose1 w:val="020B0004020202020204"/>
+    <w:charset w:val="00"/>
+    <w:family w:val="swiss"/>
+    <w:pitch w:val="variable"/>
+    <w:sig w:usb0="20000287" w:usb1="00000003" w:usb2="00000000" w:usb3="00000000" w:csb0="0000019F" w:csb1="00000000"/>
+  </w:font>
 </w:fonts>
 </file>
 
 <file path=word/glossary/settings.xml><?xml version="1.0" encoding="utf-8"?>
-<w:settings xmlns:mc="http://schemas.openxmlformats.org/markup-compatibility/2006" xmlns:o="urn:schemas-microsoft-com:office:office" xmlns:r="http://schemas.openxmlformats.org/officeDocument/2006/relationships" xmlns:m="http://schemas.openxmlformats.org/officeDocument/2006/math" xmlns:v="urn:schemas-microsoft-com:vml" xmlns:w10="urn:schemas-microsoft-com:office:word" xmlns:w="http://schemas.openxmlformats.org/wordprocessingml/2006/main" xmlns:w14="http://schemas.microsoft.com/office/word/2010/wordml" xmlns:w15="http://schemas.microsoft.com/office/word/2012/wordml" xmlns:w16cex="http://schemas.microsoft.com/office/word/2018/wordml/cex" xmlns:w16cid="http://schemas.microsoft.com/office/word/2016/wordml/cid" xmlns:w16="http://schemas.microsoft.com/office/word/2018/wordml" xmlns:w16sdtdh="http://schemas.microsoft.com/office/word/2020/wordml/sdtdatahash" xmlns:w16se="http://schemas.microsoft.com/office/word/2015/wordml/symex" xmlns:sl="http://schemas.openxmlformats.org/schemaLibrary/2006/main" mc:Ignorable="w14 w15 w16se w16cid w16 w16cex w16sdtdh">
+<w:settings xmlns:mc="http://schemas.openxmlformats.org/markup-compatibility/2006" xmlns:o="urn:schemas-microsoft-com:office:office" xmlns:r="http://schemas.openxmlformats.org/officeDocument/2006/relationships" xmlns:m="http://schemas.openxmlformats.org/officeDocument/2006/math" xmlns:v="urn:schemas-microsoft-com:vml" xmlns:w10="urn:schemas-microsoft-com:office:word" xmlns:w="http://schemas.openxmlformats.org/wordprocessingml/2006/main" xmlns:w14="http://schemas.microsoft.com/office/word/2010/wordml" xmlns:w15="http://schemas.microsoft.com/office/word/2012/wordml" xmlns:w16cex="http://schemas.microsoft.com/office/word/2018/wordml/cex" xmlns:w16cid="http://schemas.microsoft.com/office/word/2016/wordml/cid" xmlns:w16="http://schemas.microsoft.com/office/word/2018/wordml" xmlns:w16du="http://schemas.microsoft.com/office/word/2023/wordml/word16du" xmlns:w16sdtdh="http://schemas.microsoft.com/office/word/2020/wordml/sdtdatahash" xmlns:w16sdtfl="http://schemas.microsoft.com/office/word/2024/wordml/sdtformatlock" xmlns:w16se="http://schemas.microsoft.com/office/word/2015/wordml/symex" xmlns:sl="http://schemas.openxmlformats.org/schemaLibrary/2006/main" mc:Ignorable="w14 w15 w16se w16cid w16 w16cex w16sdtdh w16sdtfl w16du">
   <w:view w:val="normal"/>
   <w:revisionView w:formatting="0"/>
   <w:defaultTabStop w:val="720"/>
@@ -6225,6 +6241,7 @@
     <w:rsid w:val="000A39AE"/>
     <w:rsid w:val="001166B6"/>
     <w:rsid w:val="001C6585"/>
+    <w:rsid w:val="001F6A2D"/>
     <w:rsid w:val="003827B1"/>
     <w:rsid w:val="0042401E"/>
     <w:rsid w:val="004D6D1E"/>
@@ -6250,6 +6267,7 @@
     <w:rsid w:val="00E80E29"/>
     <w:rsid w:val="00F335CB"/>
     <w:rsid w:val="00FB711C"/>
+    <w:rsid w:val="00FF24A2"/>
   </w:rsids>
   <m:mathPr>
     <m:mathFont m:val="Cambria Math"/>
@@ -6273,7 +6291,7 @@
 </file>
 
 <file path=word/glossary/styles.xml><?xml version="1.0" encoding="utf-8"?>
-<w:styles xmlns:mc="http://schemas.openxmlformats.org/markup-compatibility/2006" xmlns:r="http://schemas.openxmlformats.org/officeDocument/2006/relationships" xmlns:w="http://schemas.openxmlformats.org/wordprocessingml/2006/main" xmlns:w14="http://schemas.microsoft.com/office/word/2010/wordml" xmlns:w15="http://schemas.microsoft.com/office/word/2012/wordml" xmlns:w16cex="http://schemas.microsoft.com/office/word/2018/wordml/cex" xmlns:w16cid="http://schemas.microsoft.com/office/word/2016/wordml/cid" xmlns:w16="http://schemas.microsoft.com/office/word/2018/wordml" xmlns:w16sdtdh="http://schemas.microsoft.com/office/word/2020/wordml/sdtdatahash" xmlns:w16se="http://schemas.microsoft.com/office/word/2015/wordml/symex" mc:Ignorable="w14 w15 w16se w16cid w16 w16cex w16sdtdh">
+<w:styles xmlns:mc="http://schemas.openxmlformats.org/markup-compatibility/2006" xmlns:r="http://schemas.openxmlformats.org/officeDocument/2006/relationships" xmlns:w="http://schemas.openxmlformats.org/wordprocessingml/2006/main" xmlns:w14="http://schemas.microsoft.com/office/word/2010/wordml" xmlns:w15="http://schemas.microsoft.com/office/word/2012/wordml" xmlns:w16cex="http://schemas.microsoft.com/office/word/2018/wordml/cex" xmlns:w16cid="http://schemas.microsoft.com/office/word/2016/wordml/cid" xmlns:w16="http://schemas.microsoft.com/office/word/2018/wordml" xmlns:w16du="http://schemas.microsoft.com/office/word/2023/wordml/word16du" xmlns:w16sdtdh="http://schemas.microsoft.com/office/word/2020/wordml/sdtdatahash" xmlns:w16sdtfl="http://schemas.microsoft.com/office/word/2024/wordml/sdtformatlock" xmlns:w16se="http://schemas.microsoft.com/office/word/2015/wordml/symex" mc:Ignorable="w14 w15 w16se w16cid w16 w16cex w16sdtdh w16sdtfl w16du">
   <w:docDefaults>
     <w:rPrDefault>
       <w:rPr>
@@ -6395,6 +6413,7 @@
     <w:lsdException w:name="HTML Sample" w:semiHidden="1" w:unhideWhenUsed="1"/>
     <w:lsdException w:name="HTML Typewriter" w:semiHidden="1" w:unhideWhenUsed="1"/>
     <w:lsdException w:name="HTML Variable" w:semiHidden="1" w:unhideWhenUsed="1"/>
+    <w:lsdException w:name="Normal Table" w:semiHidden="1" w:unhideWhenUsed="1"/>
     <w:lsdException w:name="annotation subject" w:semiHidden="1" w:unhideWhenUsed="1"/>
     <w:lsdException w:name="No List" w:semiHidden="1" w:unhideWhenUsed="1"/>
     <w:lsdException w:name="Outline List 1" w:semiHidden="1" w:unhideWhenUsed="1"/>
@@ -6437,8 +6456,11 @@
     <w:lsdException w:name="Table Contemporary" w:semiHidden="1" w:unhideWhenUsed="1"/>
     <w:lsdException w:name="Table Elegant" w:semiHidden="1" w:unhideWhenUsed="1"/>
     <w:lsdException w:name="Table Professional" w:semiHidden="1" w:unhideWhenUsed="1"/>
+    <w:lsdException w:name="Table Subtle 1" w:semiHidden="1" w:unhideWhenUsed="1"/>
     <w:lsdException w:name="Table Subtle 2" w:semiHidden="1" w:unhideWhenUsed="1"/>
     <w:lsdException w:name="Table Web 1" w:semiHidden="1" w:unhideWhenUsed="1"/>
+    <w:lsdException w:name="Table Web 2" w:semiHidden="1" w:unhideWhenUsed="1"/>
+    <w:lsdException w:name="Table Web 3" w:semiHidden="1" w:unhideWhenUsed="1"/>
     <w:lsdException w:name="Balloon Text" w:semiHidden="1" w:unhideWhenUsed="1"/>
     <w:lsdException w:name="Table Grid" w:uiPriority="39"/>
     <w:lsdException w:name="Table Theme" w:semiHidden="1" w:unhideWhenUsed="1"/>
@@ -6756,7 +6778,7 @@
 </file>
 
 <file path=word/glossary/webSettings.xml><?xml version="1.0" encoding="utf-8"?>
-<w:webSettings xmlns:mc="http://schemas.openxmlformats.org/markup-compatibility/2006" xmlns:r="http://schemas.openxmlformats.org/officeDocument/2006/relationships" xmlns:w="http://schemas.openxmlformats.org/wordprocessingml/2006/main" xmlns:w14="http://schemas.microsoft.com/office/word/2010/wordml" xmlns:w15="http://schemas.microsoft.com/office/word/2012/wordml" xmlns:w16cex="http://schemas.microsoft.com/office/word/2018/wordml/cex" xmlns:w16cid="http://schemas.microsoft.com/office/word/2016/wordml/cid" xmlns:w16="http://schemas.microsoft.com/office/word/2018/wordml" xmlns:w16sdtdh="http://schemas.microsoft.com/office/word/2020/wordml/sdtdatahash" xmlns:w16se="http://schemas.microsoft.com/office/word/2015/wordml/symex" mc:Ignorable="w14 w15 w16se w16cid w16 w16cex w16sdtdh">
+<w:webSettings xmlns:mc="http://schemas.openxmlformats.org/markup-compatibility/2006" xmlns:r="http://schemas.openxmlformats.org/officeDocument/2006/relationships" xmlns:w="http://schemas.openxmlformats.org/wordprocessingml/2006/main" xmlns:w14="http://schemas.microsoft.com/office/word/2010/wordml" xmlns:w15="http://schemas.microsoft.com/office/word/2012/wordml" xmlns:w16cex="http://schemas.microsoft.com/office/word/2018/wordml/cex" xmlns:w16cid="http://schemas.microsoft.com/office/word/2016/wordml/cid" xmlns:w16="http://schemas.microsoft.com/office/word/2018/wordml" xmlns:w16du="http://schemas.microsoft.com/office/word/2023/wordml/word16du" xmlns:w16sdtdh="http://schemas.microsoft.com/office/word/2020/wordml/sdtdatahash" xmlns:w16sdtfl="http://schemas.microsoft.com/office/word/2024/wordml/sdtformatlock" xmlns:w16se="http://schemas.microsoft.com/office/word/2015/wordml/symex" mc:Ignorable="w14 w15 w16se w16cid w16 w16cex w16sdtdh w16sdtfl w16du">
   <w:optimizeForBrowser/>
   <w:allowPNG/>
 </w:webSettings>
@@ -7058,25 +7080,25 @@
 </file>
 
 <file path=customXml/item1.xml><?xml version="1.0" encoding="utf-8"?>
+<Dictionary xmlns="http://schemas.business-integrity.com/dealbuilder/2006/dictionary" SavedByVersion="8.6.17422.1" MinimumVersion="7.2.0.0"/>
+</file>
+
+<file path=customXml/item2.xml><?xml version="1.0" encoding="utf-8"?>
 <Session xmlns="http://schemas.business-integrity.com/dealbuilder/2006/answers"/>
 </file>
 
-<file path=customXml/item2.xml><?xml version="1.0" encoding="utf-8"?>
-<Dictionary xmlns="http://schemas.business-integrity.com/dealbuilder/2006/dictionary" SavedByVersion="8.6.17422.1" MinimumVersion="7.2.0.0"/>
+<file path=customXml/itemProps1.xml><?xml version="1.0" encoding="utf-8"?>
+<ds:datastoreItem xmlns:ds="http://schemas.openxmlformats.org/officeDocument/2006/customXml" ds:itemID="{E43132FE-56DA-49E3-BA0E-E3899F9498EE}">
+  <ds:schemaRefs>
+    <ds:schemaRef ds:uri="http://schemas.business-integrity.com/dealbuilder/2006/dictionary"/>
+  </ds:schemaRefs>
+</ds:datastoreItem>
 </file>
 
-<file path=customXml/itemProps1.xml><?xml version="1.0" encoding="utf-8"?>
+<file path=customXml/itemProps2.xml><?xml version="1.0" encoding="utf-8"?>
 <ds:datastoreItem xmlns:ds="http://schemas.openxmlformats.org/officeDocument/2006/customXml" ds:itemID="{98BD657F-3829-41B9-B9AF-86E420C27365}">
   <ds:schemaRefs>
     <ds:schemaRef ds:uri="http://schemas.business-integrity.com/dealbuilder/2006/answers"/>
   </ds:schemaRefs>
 </ds:datastoreItem>
-</file>
-
-<file path=customXml/itemProps2.xml><?xml version="1.0" encoding="utf-8"?>
-<ds:datastoreItem xmlns:ds="http://schemas.openxmlformats.org/officeDocument/2006/customXml" ds:itemID="{E43132FE-56DA-49E3-BA0E-E3899F9498EE}">
-  <ds:schemaRefs>
-    <ds:schemaRef ds:uri="http://schemas.business-integrity.com/dealbuilder/2006/dictionary"/>
-  </ds:schemaRefs>
-</ds:datastoreItem>
 </file>
</xml_diff>